<commit_message>
Update the description of the project.
</commit_message>
<xml_diff>
--- a/Linux C++ project/Linux C++ project.docx
+++ b/Linux C++ project/Linux C++ project.docx
@@ -364,6 +364,7 @@
     <w:p>
       <w:pPr>
         <w:numPr>
+          <w:ilvl w:val="0"/>
           <w:numId w:val="0"/>
         </w:numPr>
         <w:ind w:left="840" w:leftChars="0" w:firstLine="420" w:firstLineChars="0"/>
@@ -379,27 +380,6 @@
         </w:rPr>
         <w:t>使用while循环来不断接受事件。</w:t>
       </w:r>
-    </w:p>
-    <w:p>
-      <w:pPr>
-        <w:numPr>
-          <w:numId w:val="0"/>
-        </w:numPr>
-        <w:ind w:left="840" w:leftChars="0" w:firstLine="420" w:firstLineChars="0"/>
-        <w:rPr>
-          <w:rFonts w:hint="default"/>
-          <w:lang w:val="en-US" w:eastAsia="zh-CN"/>
-        </w:rPr>
-      </w:pPr>
-      <w:r>
-        <w:rPr>
-          <w:rFonts w:hint="eastAsia"/>
-          <w:lang w:val="en-US" w:eastAsia="zh-CN"/>
-        </w:rPr>
-        <w:t>使用for循环处理一次接收到的所有的事件。</w:t>
-      </w:r>
-      <w:bookmarkStart w:id="0" w:name="_GoBack"/>
-      <w:bookmarkEnd w:id="0"/>
     </w:p>
     <w:p>
       <w:pPr>
@@ -424,17 +404,104 @@
     <w:p>
       <w:pPr>
         <w:numPr>
+          <w:ilvl w:val="1"/>
+          <w:numId w:val="1"/>
+        </w:numPr>
+        <w:ind w:left="420" w:leftChars="0" w:firstLine="420" w:firstLineChars="0"/>
+        <w:rPr>
+          <w:rFonts w:hint="default"/>
+          <w:lang w:val="en-US" w:eastAsia="zh-CN"/>
+        </w:rPr>
+      </w:pPr>
+      <w:r>
+        <w:rPr>
+          <w:rFonts w:hint="eastAsia"/>
+          <w:lang w:val="en-US" w:eastAsia="zh-CN"/>
+        </w:rPr>
+        <w:t>使用线程池进行具体的</w:t>
+      </w:r>
+      <w:bookmarkStart w:id="0" w:name="_GoBack"/>
+      <w:bookmarkEnd w:id="0"/>
+      <w:r>
+        <w:rPr>
+          <w:rFonts w:hint="eastAsia"/>
+          <w:lang w:val="en-US" w:eastAsia="zh-CN"/>
+        </w:rPr>
+        <w:t>处理。</w:t>
+      </w:r>
+    </w:p>
+    <w:p>
+      <w:pPr>
+        <w:numPr>
           <w:numId w:val="0"/>
         </w:numPr>
-        <w:rPr>
-          <w:rFonts w:hint="eastAsia"/>
-          <w:lang w:val="en-US" w:eastAsia="zh-CN"/>
-        </w:rPr>
-      </w:pPr>
+        <w:ind w:left="840" w:leftChars="0" w:firstLine="420" w:firstLineChars="0"/>
+        <w:rPr>
+          <w:rFonts w:hint="default"/>
+          <w:lang w:val="en-US" w:eastAsia="zh-CN"/>
+        </w:rPr>
+      </w:pPr>
+      <w:r>
+        <w:drawing>
+          <wp:inline distT="0" distB="0" distL="114300" distR="114300">
+            <wp:extent cx="5274310" cy="1443990"/>
+            <wp:effectExtent l="0" t="0" r="2540" b="3810"/>
+            <wp:docPr id="5" name="图片 1"/>
+            <wp:cNvGraphicFramePr>
+              <a:graphicFrameLocks xmlns:a="http://schemas.openxmlformats.org/drawingml/2006/main" noChangeAspect="1"/>
+            </wp:cNvGraphicFramePr>
+            <a:graphic xmlns:a="http://schemas.openxmlformats.org/drawingml/2006/main">
+              <a:graphicData uri="http://schemas.openxmlformats.org/drawingml/2006/picture">
+                <pic:pic xmlns:pic="http://schemas.openxmlformats.org/drawingml/2006/picture">
+                  <pic:nvPicPr>
+                    <pic:cNvPr id="5" name="图片 1"/>
+                    <pic:cNvPicPr>
+                      <a:picLocks noChangeAspect="1"/>
+                    </pic:cNvPicPr>
+                  </pic:nvPicPr>
+                  <pic:blipFill>
+                    <a:blip r:embed="rId8"/>
+                    <a:stretch>
+                      <a:fillRect/>
+                    </a:stretch>
+                  </pic:blipFill>
+                  <pic:spPr>
+                    <a:xfrm>
+                      <a:off x="0" y="0"/>
+                      <a:ext cx="5274310" cy="1443990"/>
+                    </a:xfrm>
+                    <a:prstGeom prst="rect">
+                      <a:avLst/>
+                    </a:prstGeom>
+                    <a:noFill/>
+                    <a:ln>
+                      <a:noFill/>
+                    </a:ln>
+                  </pic:spPr>
+                </pic:pic>
+              </a:graphicData>
+            </a:graphic>
+          </wp:inline>
+        </w:drawing>
+      </w:r>
     </w:p>
     <w:p>
       <w:pPr>
         <w:numPr>
+          <w:ilvl w:val="0"/>
+          <w:numId w:val="0"/>
+        </w:numPr>
+        <w:ind w:left="840" w:leftChars="0" w:firstLine="420" w:firstLineChars="0"/>
+        <w:rPr>
+          <w:rFonts w:hint="eastAsia"/>
+          <w:lang w:val="en-US" w:eastAsia="zh-CN"/>
+        </w:rPr>
+      </w:pPr>
+    </w:p>
+    <w:p>
+      <w:pPr>
+        <w:numPr>
+          <w:ilvl w:val="0"/>
           <w:numId w:val="0"/>
         </w:numPr>
         <w:ind w:firstLine="420" w:firstLineChars="0"/>

</xml_diff>